<commit_message>
apply style for all university
</commit_message>
<xml_diff>
--- a/последние_изменения.docx
+++ b/последние_изменения.docx
@@ -5,8 +5,11 @@
     <w:p>
       <w:pPr>
         <w:pStyle w:val="Heading1"/>
+        <w:keepNext w:val="0"/>
+        <w:keepLines w:val="0"/>
         <w:pageBreakBefore/>
-        <w:spacing w:line="240" w:lineRule="auto" w:before="0" w:after="360"/>
+        <w:widowControl w:val="0"/>
+        <w:spacing w:lineRule="exact" w:line="360" w:before="0" w:after="360"/>
         <w:ind w:left="0" w:right="0" w:firstLine="709"/>
       </w:pPr>
       <w:r>
@@ -17,573 +20,15 @@
           <w:color w:val="000000"/>
           <w:sz w:val="28"/>
         </w:rPr>
-        <w:t>1 Раздел первый</w:t>
+        <w:t>1 ГЛАВА РАЗД ЙКШ DSADNSA</w:t>
       </w:r>
     </w:p>
-    <w:p>
-      <w:pPr>
-        <w:spacing w:line="240" w:lineRule="auto" w:before="0" w:after="0"/>
-        <w:ind w:left="0" w:right="0" w:firstLine="709"/>
-        <w:jc w:val="both"/>
-      </w:pPr>
-      <w:r>
-        <w:rPr>
-          <w:rFonts w:ascii="Times New Roman" w:hAnsi="Times New Roman"/>
-          <w:b w:val="0"/>
-          <w:i w:val="0"/>
-          <w:color w:val="000000"/>
-          <w:sz w:val="28"/>
-        </w:rPr>
-        <w:t>Компонент-текст позволяет добавлять текст на страницу и форматировать его с помощью стилей, заданных в теме. Панель инструментов форматирования недоступна при редактировании содержимого, поэтому невозможно перезаписать выбранный стиль пользовательским форматированием.</w:t>
-      </w:r>
-    </w:p>
-    <w:p>
-      <w:pPr>
-        <w:spacing w:line="240" w:lineRule="auto" w:before="280" w:after="0"/>
-        <w:ind w:left="0" w:right="0" w:firstLine="0"/>
-        <w:jc w:val="center"/>
-      </w:pPr>
-      <w:r>
-        <w:drawing>
-          <wp:inline xmlns:a="http://schemas.openxmlformats.org/drawingml/2006/main" xmlns:pic="http://schemas.openxmlformats.org/drawingml/2006/picture">
-            <wp:extent cx="3371850" cy="3438525"/>
-            <wp:docPr id="1" name="Picture 1"/>
-            <wp:cNvGraphicFramePr>
-              <a:graphicFrameLocks noChangeAspect="1"/>
-            </wp:cNvGraphicFramePr>
-            <a:graphic>
-              <a:graphicData uri="http://schemas.openxmlformats.org/drawingml/2006/picture">
-                <pic:pic>
-                  <pic:nvPicPr>
-                    <pic:cNvPr id="0" name="image.png"/>
-                    <pic:cNvPicPr/>
-                  </pic:nvPicPr>
-                  <pic:blipFill>
-                    <a:blip r:embed="rId9"/>
-                    <a:stretch>
-                      <a:fillRect/>
-                    </a:stretch>
-                  </pic:blipFill>
-                  <pic:spPr>
-                    <a:xfrm>
-                      <a:off x="0" y="0"/>
-                      <a:ext cx="3371850" cy="3438525"/>
-                    </a:xfrm>
-                    <a:prstGeom prst="rect"/>
-                  </pic:spPr>
-                </pic:pic>
-              </a:graphicData>
-            </a:graphic>
-          </wp:inline>
-        </w:drawing>
-      </w:r>
-    </w:p>
-    <w:p>
-      <w:pPr>
-        <w:spacing w:line="240" w:lineRule="auto" w:before="120" w:after="280"/>
-        <w:ind w:left="0" w:right="0" w:firstLine="0"/>
-        <w:jc w:val="center"/>
-      </w:pPr>
-      <w:r>
-        <w:rPr>
-          <w:rFonts w:ascii="Times New Roman" w:hAnsi="Times New Roman"/>
-          <w:b w:val="0"/>
-          <w:i w:val="0"/>
-          <w:color w:val="000000"/>
-          <w:sz w:val="28"/>
-        </w:rPr>
-        <w:t>Рисунок 1.1 – пример рисунка</w:t>
-      </w:r>
-    </w:p>
-    <w:p>
-      <w:pPr>
-        <w:spacing w:line="240" w:lineRule="auto" w:before="0" w:after="0"/>
-        <w:ind w:left="0" w:right="0" w:firstLine="709"/>
-        <w:jc w:val="both"/>
-      </w:pPr>
-      <w:r>
-        <w:rPr>
-          <w:rFonts w:ascii="Times New Roman" w:hAnsi="Times New Roman"/>
-          <w:b w:val="0"/>
-          <w:i w:val="0"/>
-          <w:color w:val="000000"/>
-          <w:sz w:val="28"/>
-        </w:rPr>
-        <w:t>Это полезно, если используется стандартное форматирование для таких элементов, как заголовки. Можно обновить стили, определенные в теме, и автоматически обновить связанный текст на сайте без перезаписи формата.</w:t>
-      </w:r>
-    </w:p>
-    <w:p>
-      <w:pPr>
-        <w:pStyle w:val="Heading2"/>
-        <w:spacing w:line="240" w:lineRule="auto" w:before="360" w:after="240"/>
-        <w:ind w:left="0" w:right="0" w:firstLine="709"/>
-      </w:pPr>
-      <w:r>
-        <w:rPr>
-          <w:rFonts w:ascii="Times New Roman" w:hAnsi="Times New Roman"/>
-          <w:b/>
-          <w:i w:val="0"/>
-          <w:color w:val="000000"/>
-          <w:sz w:val="28"/>
-        </w:rPr>
-        <w:t>1.2 Подраздел первый тест</w:t>
-      </w:r>
-    </w:p>
-    <w:p>
-      <w:pPr>
-        <w:spacing w:line="240" w:lineRule="auto" w:before="280" w:after="0"/>
-        <w:ind w:left="0" w:right="0" w:firstLine="0"/>
-        <w:jc w:val="left"/>
-      </w:pPr>
-      <w:r>
-        <w:rPr>
-          <w:rFonts w:ascii="Times New Roman" w:hAnsi="Times New Roman"/>
-          <w:i w:val="0"/>
-          <w:color w:val="000000"/>
-          <w:sz w:val="28"/>
-        </w:rPr>
-        <w:t>Таблица 1.1 – пример описания</w:t>
-      </w:r>
-    </w:p>
-    <w:tbl>
-      <w:tblPr>
-        <w:tblW w:type="auto" w:w="0"/>
-        <w:tblLayout w:type="fixed"/>
-        <w:tblLook w:firstColumn="1" w:firstRow="1" w:lastColumn="0" w:lastRow="0" w:noHBand="0" w:noVBand="1" w:val="04A0"/>
-      </w:tblPr>
-      <w:tblGrid>
-        <w:gridCol w:w="4844"/>
-        <w:gridCol w:w="4844"/>
-      </w:tblGrid>
-      <w:tr>
-        <w:tc>
-          <w:tcPr>
-            <w:tcW w:type="dxa" w:w="4844"/>
-            <w:vAlign w:val="center"/>
-            <w:tcBorders>
-              <w:top w:val="single" w:sz="4" w:color="000000"/>
-              <w:left w:val="single" w:sz="4" w:color="000000"/>
-              <w:bottom w:val="single" w:sz="4" w:color="000000"/>
-              <w:right w:val="single" w:sz="4" w:color="000000"/>
-            </w:tcBorders>
-          </w:tcPr>
-          <w:p>
-            <w:pPr>
-              <w:spacing w:line="240" w:lineRule="auto" w:before="0" w:after="0"/>
-              <w:ind w:left="0" w:right="0" w:firstLine="0"/>
-              <w:jc w:val="center"/>
-            </w:pPr>
-            <w:r>
-              <w:rPr>
-                <w:rFonts w:ascii="Times New Roman" w:hAnsi="Times New Roman"/>
-                <w:i w:val="0"/>
-                <w:color w:val="000000"/>
-                <w:sz w:val="24"/>
-              </w:rPr>
-              <w:t>1</w:t>
-            </w:r>
-          </w:p>
-        </w:tc>
-        <w:tc>
-          <w:tcPr>
-            <w:tcW w:type="dxa" w:w="4844"/>
-            <w:vAlign w:val="center"/>
-            <w:tcBorders>
-              <w:top w:val="single" w:sz="4" w:color="000000"/>
-              <w:left w:val="single" w:sz="4" w:color="000000"/>
-              <w:bottom w:val="single" w:sz="4" w:color="000000"/>
-              <w:right w:val="single" w:sz="4" w:color="000000"/>
-            </w:tcBorders>
-          </w:tcPr>
-          <w:p>
-            <w:pPr>
-              <w:spacing w:line="240" w:lineRule="auto" w:before="0" w:after="0"/>
-              <w:ind w:left="0" w:right="0" w:firstLine="0"/>
-              <w:jc w:val="left"/>
-            </w:pPr>
-            <w:r>
-              <w:rPr>
-                <w:rFonts w:ascii="Times New Roman" w:hAnsi="Times New Roman"/>
-                <w:i w:val="0"/>
-                <w:color w:val="000000"/>
-                <w:sz w:val="24"/>
-              </w:rPr>
-              <w:t>2</w:t>
-            </w:r>
-          </w:p>
-        </w:tc>
-      </w:tr>
-      <w:tr>
-        <w:tc>
-          <w:tcPr>
-            <w:tcW w:type="dxa" w:w="4844"/>
-            <w:vAlign w:val="center"/>
-            <w:tcBorders>
-              <w:top w:val="single" w:sz="4" w:color="000000"/>
-              <w:left w:val="single" w:sz="4" w:color="000000"/>
-              <w:bottom w:val="single" w:sz="4" w:color="000000"/>
-              <w:right w:val="single" w:sz="4" w:color="000000"/>
-            </w:tcBorders>
-          </w:tcPr>
-          <w:p>
-            <w:pPr>
-              <w:spacing w:line="240" w:lineRule="auto" w:before="0" w:after="0"/>
-              <w:ind w:left="0" w:right="0" w:firstLine="0"/>
-              <w:jc w:val="center"/>
-            </w:pPr>
-            <w:r>
-              <w:rPr>
-                <w:rFonts w:ascii="Times New Roman" w:hAnsi="Times New Roman"/>
-                <w:i w:val="0"/>
-                <w:color w:val="000000"/>
-                <w:sz w:val="24"/>
-              </w:rPr>
-              <w:t>3</w:t>
-            </w:r>
-          </w:p>
-        </w:tc>
-        <w:tc>
-          <w:tcPr>
-            <w:tcW w:type="dxa" w:w="4844"/>
-            <w:vAlign w:val="center"/>
-            <w:tcBorders>
-              <w:top w:val="single" w:sz="4" w:color="000000"/>
-              <w:left w:val="single" w:sz="4" w:color="000000"/>
-              <w:bottom w:val="single" w:sz="4" w:color="000000"/>
-              <w:right w:val="single" w:sz="4" w:color="000000"/>
-            </w:tcBorders>
-          </w:tcPr>
-          <w:p>
-            <w:pPr>
-              <w:spacing w:line="240" w:lineRule="auto" w:before="0" w:after="0"/>
-              <w:ind w:left="0" w:right="0" w:firstLine="0"/>
-              <w:jc w:val="center"/>
-            </w:pPr>
-            <w:r>
-              <w:rPr>
-                <w:rFonts w:ascii="Times New Roman" w:hAnsi="Times New Roman"/>
-                <w:i w:val="0"/>
-                <w:color w:val="000000"/>
-                <w:sz w:val="24"/>
-              </w:rPr>
-              <w:t>4</w:t>
-            </w:r>
-          </w:p>
-        </w:tc>
-      </w:tr>
-    </w:tbl>
-    <w:p>
-      <w:pPr>
-        <w:spacing w:line="240" w:lineRule="auto" w:before="280" w:after="0"/>
-        <w:ind w:left="0" w:right="0" w:firstLine="709"/>
-        <w:jc w:val="both"/>
-      </w:pPr>
-      <w:r>
-        <w:rPr>
-          <w:rFonts w:ascii="Times New Roman" w:hAnsi="Times New Roman"/>
-          <w:b w:val="0"/>
-          <w:i w:val="0"/>
-          <w:color w:val="000000"/>
-          <w:sz w:val="28"/>
-        </w:rPr>
-        <w:t>Выводы исследования: лонгриды присутствуют в изданиях разных типов: от ежедневных газет − до нишевых новостных сайтов. Они посвящены, как правило, описанию нового явления; имеют объем от 2 до 4 тыс. слов и построены по композиционной схеме чередования примеров и обобщений.</w:t>
-      </w:r>
-    </w:p>
-    <w:p>
-      <w:pPr>
-        <w:spacing w:line="240" w:lineRule="auto" w:before="280" w:after="0"/>
-        <w:ind w:left="0" w:right="0" w:firstLine="0"/>
-        <w:suppressAutoHyphens w:val="true"/>
-        <w:pBdr>
-          <w:top w:val="single" w:sz="4" w:space="4" w:color="000000"/>
-          <w:left w:val="single" w:sz="4" w:space="4" w:color="000000"/>
-          <w:bottom w:val="single" w:sz="4" w:space="4" w:color="000000"/>
-          <w:right w:val="single" w:sz="4" w:space="4" w:color="000000"/>
-        </w:pBdr>
-      </w:pPr>
-      <w:r>
-        <w:rPr>
-          <w:rFonts w:ascii="Courier New" w:hAnsi="Courier New"/>
-          <w:b w:val="0"/>
-          <w:i w:val="0"/>
-          <w:color w:val="000000"/>
-          <w:sz w:val="24"/>
-        </w:rPr>
-        <w:t>@Aspect</w:t>
-        <w:br/>
-        <w:t>@Component</w:t>
-        <w:br/>
-        <w:t>public class LoggingAspect {</w:t>
-        <w:br/>
-        <w:br/>
-        <w:t xml:space="preserve">    @Around("execution(* com.example.service.MyService.*(..))")</w:t>
-        <w:br/>
-        <w:t xml:space="preserve">    public Object logExecutionTime(ProceedingJoinPoint joinPoint) throws Throwable {</w:t>
-        <w:br/>
-        <w:t xml:space="preserve">        long start = System.currentTimeMillis();</w:t>
-        <w:br/>
-        <w:br/>
-        <w:t xml:space="preserve">        Object result = joinPoint.proceed(); // Execute the original method</w:t>
-        <w:br/>
-        <w:br/>
-        <w:t xml:space="preserve">        long executionTime = System.currentTimeMillis() - start;</w:t>
-        <w:br/>
-        <w:t xml:space="preserve">        System.out.println(joinPoint.getSignature() + " executed in " + executionTime + "ms");</w:t>
-        <w:br/>
-        <w:br/>
-        <w:t xml:space="preserve">        return result;</w:t>
-        <w:br/>
-        <w:t xml:space="preserve">    }</w:t>
-        <w:br/>
-        <w:t>}</w:t>
-      </w:r>
-    </w:p>
-    <w:p>
-      <w:pPr>
-        <w:spacing w:line="240" w:lineRule="auto" w:before="120" w:after="280"/>
-        <w:ind w:left="0" w:right="0" w:firstLine="0"/>
-        <w:jc w:val="center"/>
-      </w:pPr>
-      <w:r>
-        <w:rPr>
-          <w:rFonts w:ascii="Times New Roman" w:hAnsi="Times New Roman"/>
-          <w:b w:val="0"/>
-          <w:i w:val="0"/>
-          <w:color w:val="000000"/>
-          <w:sz w:val="28"/>
-        </w:rPr>
-        <w:t>Листинг 1.1 – пример аспекта</w:t>
-      </w:r>
-    </w:p>
-    <w:p>
-      <w:pPr>
-        <w:spacing w:before="0" w:line="240" w:lineRule="auto" w:after="0"/>
-        <w:ind w:left="0" w:right="0" w:firstLine="709"/>
-        <w:jc w:val="both"/>
-      </w:pPr>
-      <w:r>
-        <w:rPr>
-          <w:rFonts w:ascii="Times New Roman" w:hAnsi="Times New Roman"/>
-          <w:b w:val="0"/>
-          <w:i w:val="0"/>
-          <w:color w:val="000000"/>
-          <w:sz w:val="28"/>
-        </w:rPr>
-        <w:t>– первый элемент;</w:t>
-      </w:r>
-    </w:p>
-    <w:p>
-      <w:pPr>
-        <w:spacing w:line="240" w:lineRule="auto" w:after="0"/>
-        <w:ind w:left="0" w:right="0" w:firstLine="709"/>
-        <w:jc w:val="both"/>
-      </w:pPr>
-      <w:r>
-        <w:rPr>
-          <w:rFonts w:ascii="Times New Roman" w:hAnsi="Times New Roman"/>
-          <w:b w:val="0"/>
-          <w:i w:val="0"/>
-          <w:color w:val="000000"/>
-          <w:sz w:val="28"/>
-        </w:rPr>
-        <w:t>– второй элемент;</w:t>
-      </w:r>
-    </w:p>
-    <w:p>
-      <w:pPr>
-        <w:spacing w:line="240" w:lineRule="auto" w:after="0"/>
-        <w:ind w:left="0" w:right="0" w:firstLine="709"/>
-        <w:jc w:val="both"/>
-      </w:pPr>
-      <w:r>
-        <w:rPr>
-          <w:rFonts w:ascii="Times New Roman" w:hAnsi="Times New Roman"/>
-          <w:b w:val="0"/>
-          <w:i w:val="0"/>
-          <w:color w:val="000000"/>
-          <w:sz w:val="28"/>
-        </w:rPr>
-        <w:t>– третий элемент.</w:t>
-      </w:r>
-    </w:p>
-    <w:tbl>
-      <w:tblPr>
-        <w:tblW w:type="auto" w:w="0"/>
-        <w:tblLayout w:type="fixed"/>
-        <w:tblLook w:firstColumn="1" w:firstRow="1" w:lastColumn="0" w:lastRow="0" w:noHBand="0" w:noVBand="1" w:val="04A0"/>
-      </w:tblPr>
-      <w:tblGrid>
-        <w:gridCol w:w="3230"/>
-        <w:gridCol w:w="3230"/>
-        <w:gridCol w:w="3230"/>
-      </w:tblGrid>
-      <w:tr>
-        <w:tc>
-          <w:tcPr>
-            <w:tcW w:type="dxa" w:w="969"/>
-          </w:tcPr>
-          <w:p/>
-        </w:tc>
-        <w:tc>
-          <w:tcPr>
-            <w:tcW w:type="dxa" w:w="7751"/>
-            <w:vAlign w:val="center"/>
-          </w:tcPr>
-          <w:p>
-            <w:pPr>
-              <w:spacing w:line="240" w:lineRule="auto" w:before="240" w:after="240"/>
-              <w:ind w:left="0" w:right="0" w:firstLine="0"/>
-              <w:jc w:val="center"/>
-            </w:pPr>
-            <w:r>
-              <w:rPr>
-                <w:b w:val="0"/>
-                <w:i w:val="0"/>
-                <w:color w:val="000000"/>
-                <w:sz w:val="28"/>
-              </w:rPr>
-              <m:oMath xmlns:mml="http://www.w3.org/1998/Math/MathML">
-                <m:sSup>
-                  <m:e>
-                    <m:r>
-                      <m:t>30</m:t>
-                    </m:r>
-                  </m:e>
-                  <m:sup>
-                    <m:r>
-                      <m:t>2</m:t>
-                    </m:r>
-                  </m:sup>
-                </m:sSup>
-                <m:r>
-                  <m:t>−30=5−10x</m:t>
-                </m:r>
-                <m:f>
-                  <m:fPr>
-                    <m:type m:val="bar"/>
-                  </m:fPr>
-                  <m:num>
-                    <m:r>
-                      <m:t>10</m:t>
-                    </m:r>
-                  </m:num>
-                  <m:den>
-                    <m:r>
-                      <m:t>−3−10y</m:t>
-                    </m:r>
-                  </m:den>
-                </m:f>
-                <m:r>
-                  <m:t>*</m:t>
-                </m:r>
-                <m:rad>
-                  <m:radPr>
-                    <m:degHide m:val="on"/>
-                  </m:radPr>
-                  <m:deg/>
-                  <m:e>
-                    <m:r>
-                      <m:t>49</m:t>
-                    </m:r>
-                  </m:e>
-                </m:rad>
-              </m:oMath>
-            </w:r>
-          </w:p>
-        </w:tc>
-        <w:tc>
-          <w:tcPr>
-            <w:tcW w:type="dxa" w:w="969"/>
-            <w:vAlign w:val="center"/>
-          </w:tcPr>
-          <w:p>
-            <w:pPr>
-              <w:spacing w:line="240" w:lineRule="auto" w:before="240" w:after="240"/>
-              <w:ind w:left="0" w:right="0" w:firstLine="0"/>
-              <w:jc w:val="right"/>
-            </w:pPr>
-            <w:r>
-              <w:rPr>
-                <w:rFonts w:ascii="Times New Roman" w:hAnsi="Times New Roman"/>
-                <w:b w:val="0"/>
-                <w:i w:val="0"/>
-                <w:color w:val="000000"/>
-                <w:sz w:val="28"/>
-              </w:rPr>
-              <w:t>(1.1)</w:t>
-            </w:r>
-          </w:p>
-        </w:tc>
-      </w:tr>
-    </w:tbl>
-    <w:p>
-      <w:pPr>
-        <w:pStyle w:val="Heading2"/>
-        <w:spacing w:line="240" w:lineRule="auto" w:before="360" w:after="240"/>
-        <w:ind w:left="0" w:right="0" w:firstLine="709"/>
-      </w:pPr>
-      <w:r>
-        <w:rPr>
-          <w:rFonts w:ascii="Times New Roman" w:hAnsi="Times New Roman"/>
-          <w:b/>
-          <w:i w:val="0"/>
-          <w:color w:val="000000"/>
-          <w:sz w:val="28"/>
-        </w:rPr>
-        <w:t>1.1 подраздел второй</w:t>
-      </w:r>
-    </w:p>
-    <w:p>
-      <w:pPr>
-        <w:spacing w:line="240" w:lineRule="auto" w:before="0" w:after="0"/>
-        <w:ind w:left="0" w:right="0" w:firstLine="709"/>
-        <w:jc w:val="both"/>
-      </w:pPr>
-      <w:r>
-        <w:rPr>
-          <w:rFonts w:ascii="Times New Roman" w:hAnsi="Times New Roman"/>
-          <w:b w:val="0"/>
-          <w:i w:val="0"/>
-          <w:color w:val="000000"/>
-          <w:sz w:val="28"/>
-        </w:rPr>
-        <w:t>За которыми в журналистской среде закрепилось название «длинные тексты» (англ. – long forms) или лонгриды (от англ. − long read – материал, предназначенный для длительного прочтения, в отличие от маленькой заметки).</w:t>
-      </w:r>
-    </w:p>
-    <w:p>
-      <w:pPr>
-        <w:pStyle w:val="Heading2"/>
-        <w:spacing w:line="240" w:lineRule="auto" w:before="360" w:after="240"/>
-        <w:ind w:left="0" w:right="0" w:firstLine="709"/>
-      </w:pPr>
-      <w:r>
-        <w:rPr>
-          <w:rFonts w:ascii="Times New Roman" w:hAnsi="Times New Roman"/>
-          <w:b/>
-          <w:i w:val="0"/>
-          <w:color w:val="000000"/>
-          <w:sz w:val="28"/>
-        </w:rPr>
-        <w:t>1.3 подраздел третий</w:t>
-      </w:r>
-    </w:p>
-    <w:p>
-      <w:pPr>
-        <w:spacing w:line="240" w:lineRule="auto" w:before="0" w:after="0"/>
-        <w:ind w:left="0" w:right="0" w:firstLine="709"/>
-        <w:jc w:val="both"/>
-      </w:pPr>
-      <w:r>
-        <w:rPr>
-          <w:rFonts w:ascii="Times New Roman" w:hAnsi="Times New Roman"/>
-          <w:b w:val="0"/>
-          <w:i w:val="0"/>
-          <w:color w:val="000000"/>
-          <w:sz w:val="28"/>
-        </w:rPr>
-        <w:t>Во все большем количестве российских изданий − как печатных, так и онлайновых − появляются объемные материалы особого типа, за которыми в журналистской среде закрепилось название «длинные тексты» (англ. – long forms) или лонгриды (от англ. − long read – материал, предназначенный для длительного прочтения, в отличие от маленькой заметки).</w:t>
-      </w:r>
-    </w:p>
+    <w:sectPr>
+      <w:pgSz w:w="12240" w:h="15840"/>
+      <w:pgMar w:top="1134" w:right="850" w:bottom="1134" w:left="1701" w:header="720" w:footer="720" w:gutter="0"/>
+      <w:cols w:space="720"/>
+      <w:docGrid w:linePitch="360"/>
+    </w:sectPr>
   </w:body>
 </w:document>
 </file>

</xml_diff>